<commit_message>
Expand reports into step-by-step teaching site
</commit_message>
<xml_diff>
--- a/reports/分报告/00_我们要控制的究竟是什么.docx
+++ b/reports/分报告/00_我们要控制的究竟是什么.docx
@@ -208,6 +208,477 @@
         <w:t>。</w:t>
       </w:r>
     </w:p>
+    <w:p>
+      <w:pPr>
+        <w:spacing w:before="200" w:after="80"/>
+      </w:pPr>
+      <w:r>
+        <w:rPr>
+          <w:rFonts w:ascii="微软雅黑" w:hAnsi="微软雅黑" w:eastAsia="微软雅黑"/>
+          <w:b/>
+          <w:i w:val="0"/>
+          <w:color w:val="1F4E79"/>
+          <w:sz w:val="30"/>
+        </w:rPr>
+        <w:t>阅读路线</w:t>
+      </w:r>
+    </w:p>
+    <w:p>
+      <w:pPr>
+        <w:spacing w:after="80"/>
+      </w:pPr>
+      <w:r>
+        <w:rPr>
+          <w:rFonts w:ascii="微软雅黑" w:hAnsi="微软雅黑" w:eastAsia="微软雅黑"/>
+          <w:b w:val="0"/>
+          <w:i w:val="0"/>
+          <w:sz w:val="21"/>
+        </w:rPr>
+        <w:t>先建立问题地图：对象、七种方法、结果口径和仿真边界。</w:t>
+      </w:r>
+    </w:p>
+    <w:p>
+      <w:pPr>
+        <w:spacing w:after="80"/>
+      </w:pPr>
+      <w:r>
+        <w:rPr>
+          <w:rFonts w:ascii="微软雅黑" w:hAnsi="微软雅黑" w:eastAsia="微软雅黑"/>
+          <w:b w:val="0"/>
+          <w:i w:val="0"/>
+          <w:sz w:val="21"/>
+        </w:rPr>
+        <w:t>按下面的顺序阅读：</w:t>
+      </w:r>
+    </w:p>
+    <w:p>
+      <w:pPr>
+        <w:spacing w:after="40"/>
+        <w:ind w:left="425"/>
+      </w:pPr>
+      <w:r>
+        <w:rPr>
+          <w:rFonts w:ascii="微软雅黑" w:hAnsi="微软雅黑" w:eastAsia="微软雅黑"/>
+          <w:b/>
+          <w:i w:val="0"/>
+          <w:color w:val="1F4E79"/>
+          <w:sz w:val="21"/>
+        </w:rPr>
+        <w:t xml:space="preserve">1. </w:t>
+      </w:r>
+      <w:r>
+        <w:rPr>
+          <w:rFonts w:ascii="微软雅黑" w:hAnsi="微软雅黑" w:eastAsia="微软雅黑"/>
+          <w:b/>
+          <w:i w:val="0"/>
+          <w:sz w:val="21"/>
+        </w:rPr>
+        <w:t>问题</w:t>
+      </w:r>
+      <w:r>
+        <w:rPr>
+          <w:rFonts w:ascii="微软雅黑" w:hAnsi="微软雅黑" w:eastAsia="微软雅黑"/>
+          <w:b w:val="0"/>
+          <w:i w:val="0"/>
+          <w:sz w:val="21"/>
+        </w:rPr>
+        <w:t>：先说清这一步想回答什么，避免把指标当成结论。</w:t>
+      </w:r>
+    </w:p>
+    <w:p>
+      <w:pPr>
+        <w:spacing w:after="40"/>
+        <w:ind w:left="425"/>
+      </w:pPr>
+      <w:r>
+        <w:rPr>
+          <w:rFonts w:ascii="微软雅黑" w:hAnsi="微软雅黑" w:eastAsia="微软雅黑"/>
+          <w:b/>
+          <w:i w:val="0"/>
+          <w:color w:val="1F4E79"/>
+          <w:sz w:val="21"/>
+        </w:rPr>
+        <w:t xml:space="preserve">2. </w:t>
+      </w:r>
+      <w:r>
+        <w:rPr>
+          <w:rFonts w:ascii="微软雅黑" w:hAnsi="微软雅黑" w:eastAsia="微软雅黑"/>
+          <w:b/>
+          <w:i w:val="0"/>
+          <w:sz w:val="21"/>
+        </w:rPr>
+        <w:t>准备</w:t>
+      </w:r>
+      <w:r>
+        <w:rPr>
+          <w:rFonts w:ascii="微软雅黑" w:hAnsi="微软雅黑" w:eastAsia="微软雅黑"/>
+          <w:b w:val="0"/>
+          <w:i w:val="0"/>
+          <w:sz w:val="21"/>
+        </w:rPr>
+        <w:t>：列出前置章节、配置、数据来源和版本；本篇不运行新的训练批次，重点是读懂证据和口径。</w:t>
+      </w:r>
+    </w:p>
+    <w:p>
+      <w:pPr>
+        <w:spacing w:after="40"/>
+        <w:ind w:left="425"/>
+      </w:pPr>
+      <w:r>
+        <w:rPr>
+          <w:rFonts w:ascii="微软雅黑" w:hAnsi="微软雅黑" w:eastAsia="微软雅黑"/>
+          <w:b/>
+          <w:i w:val="0"/>
+          <w:color w:val="1F4E79"/>
+          <w:sz w:val="21"/>
+        </w:rPr>
+        <w:t xml:space="preserve">3. </w:t>
+      </w:r>
+      <w:r>
+        <w:rPr>
+          <w:rFonts w:ascii="微软雅黑" w:hAnsi="微软雅黑" w:eastAsia="微软雅黑"/>
+          <w:b/>
+          <w:i w:val="0"/>
+          <w:sz w:val="21"/>
+        </w:rPr>
+        <w:t>运行</w:t>
+      </w:r>
+      <w:r>
+        <w:rPr>
+          <w:rFonts w:ascii="微软雅黑" w:hAnsi="微软雅黑" w:eastAsia="微软雅黑"/>
+          <w:b w:val="0"/>
+          <w:i w:val="0"/>
+          <w:sz w:val="21"/>
+        </w:rPr>
+        <w:t>：复制命令或读取封存产物，记录输出目录和随机种子。</w:t>
+      </w:r>
+    </w:p>
+    <w:p>
+      <w:pPr>
+        <w:spacing w:after="40"/>
+        <w:ind w:left="425"/>
+      </w:pPr>
+      <w:r>
+        <w:rPr>
+          <w:rFonts w:ascii="微软雅黑" w:hAnsi="微软雅黑" w:eastAsia="微软雅黑"/>
+          <w:b/>
+          <w:i w:val="0"/>
+          <w:color w:val="1F4E79"/>
+          <w:sz w:val="21"/>
+        </w:rPr>
+        <w:t xml:space="preserve">4. </w:t>
+      </w:r>
+      <w:r>
+        <w:rPr>
+          <w:rFonts w:ascii="微软雅黑" w:hAnsi="微软雅黑" w:eastAsia="微软雅黑"/>
+          <w:b/>
+          <w:i w:val="0"/>
+          <w:sz w:val="21"/>
+        </w:rPr>
+        <w:t>走查</w:t>
+      </w:r>
+      <w:r>
+        <w:rPr>
+          <w:rFonts w:ascii="微软雅黑" w:hAnsi="微软雅黑" w:eastAsia="微软雅黑"/>
+          <w:b w:val="0"/>
+          <w:i w:val="0"/>
+          <w:sz w:val="21"/>
+        </w:rPr>
+        <w:t>：用一个具体数值代入公式，再对照实现中的关键几行。</w:t>
+      </w:r>
+    </w:p>
+    <w:p>
+      <w:pPr>
+        <w:spacing w:after="40"/>
+        <w:ind w:left="425"/>
+      </w:pPr>
+      <w:r>
+        <w:rPr>
+          <w:rFonts w:ascii="微软雅黑" w:hAnsi="微软雅黑" w:eastAsia="微软雅黑"/>
+          <w:b/>
+          <w:i w:val="0"/>
+          <w:color w:val="1F4E79"/>
+          <w:sz w:val="21"/>
+        </w:rPr>
+        <w:t xml:space="preserve">5. </w:t>
+      </w:r>
+      <w:r>
+        <w:rPr>
+          <w:rFonts w:ascii="微软雅黑" w:hAnsi="微软雅黑" w:eastAsia="微软雅黑"/>
+          <w:b/>
+          <w:i w:val="0"/>
+          <w:sz w:val="21"/>
+        </w:rPr>
+        <w:t>观察</w:t>
+      </w:r>
+      <w:r>
+        <w:rPr>
+          <w:rFonts w:ascii="微软雅黑" w:hAnsi="微软雅黑" w:eastAsia="微软雅黑"/>
+          <w:b w:val="0"/>
+          <w:i w:val="0"/>
+          <w:sz w:val="21"/>
+        </w:rPr>
+        <w:t>：先读坐标、曲线和表格，再说明“发生了什么”和“这说明什么”。</w:t>
+      </w:r>
+    </w:p>
+    <w:p>
+      <w:pPr>
+        <w:spacing w:after="40"/>
+        <w:ind w:left="425"/>
+      </w:pPr>
+      <w:r>
+        <w:rPr>
+          <w:rFonts w:ascii="微软雅黑" w:hAnsi="微软雅黑" w:eastAsia="微软雅黑"/>
+          <w:b/>
+          <w:i w:val="0"/>
+          <w:color w:val="1F4E79"/>
+          <w:sz w:val="21"/>
+        </w:rPr>
+        <w:t xml:space="preserve">6. </w:t>
+      </w:r>
+      <w:r>
+        <w:rPr>
+          <w:rFonts w:ascii="微软雅黑" w:hAnsi="微软雅黑" w:eastAsia="微软雅黑"/>
+          <w:b/>
+          <w:i w:val="0"/>
+          <w:sz w:val="21"/>
+        </w:rPr>
+        <w:t>核对</w:t>
+      </w:r>
+      <w:r>
+        <w:rPr>
+          <w:rFonts w:ascii="微软雅黑" w:hAnsi="微软雅黑" w:eastAsia="微软雅黑"/>
+          <w:b w:val="0"/>
+          <w:i w:val="0"/>
+          <w:sz w:val="21"/>
+        </w:rPr>
+        <w:t>：用容差、断言、哈希或独立验证判断复现是否成功。</w:t>
+      </w:r>
+    </w:p>
+    <w:p>
+      <w:pPr>
+        <w:spacing w:after="40"/>
+        <w:ind w:left="425"/>
+      </w:pPr>
+      <w:r>
+        <w:rPr>
+          <w:rFonts w:ascii="微软雅黑" w:hAnsi="微软雅黑" w:eastAsia="微软雅黑"/>
+          <w:b/>
+          <w:i w:val="0"/>
+          <w:color w:val="1F4E79"/>
+          <w:sz w:val="21"/>
+        </w:rPr>
+        <w:t xml:space="preserve">7. </w:t>
+      </w:r>
+      <w:r>
+        <w:rPr>
+          <w:rFonts w:ascii="微软雅黑" w:hAnsi="微软雅黑" w:eastAsia="微软雅黑"/>
+          <w:b/>
+          <w:i w:val="0"/>
+          <w:sz w:val="21"/>
+        </w:rPr>
+        <w:t>边界</w:t>
+      </w:r>
+      <w:r>
+        <w:rPr>
+          <w:rFonts w:ascii="微软雅黑" w:hAnsi="微软雅黑" w:eastAsia="微软雅黑"/>
+          <w:b w:val="0"/>
+          <w:i w:val="0"/>
+          <w:sz w:val="21"/>
+        </w:rPr>
+        <w:t>：把已经证明、只作观察和仍待验证的内容分开写。</w:t>
+      </w:r>
+    </w:p>
+    <w:tbl>
+      <w:tblPr>
+        <w:tblStyle w:val="TableGrid"/>
+        <w:tblW w:type="auto" w:w="0"/>
+        <w:tblLook w:firstColumn="1" w:firstRow="1" w:lastColumn="0" w:lastRow="0" w:noHBand="0" w:noVBand="1" w:val="04A0"/>
+      </w:tblPr>
+      <w:tblGrid>
+        <w:gridCol w:w="4759"/>
+        <w:gridCol w:w="4759"/>
+      </w:tblGrid>
+      <w:tr>
+        <w:tc>
+          <w:tcPr>
+            <w:tcW w:type="dxa" w:w="4759"/>
+            <w:shd w:fill="DEEAF6" w:val="clear"/>
+          </w:tcPr>
+          <w:p>
+            <w:pPr>
+              <w:jc w:val="center"/>
+            </w:pPr>
+            <w:r>
+              <w:rPr>
+                <w:rFonts w:ascii="微软雅黑" w:hAnsi="微软雅黑" w:eastAsia="微软雅黑"/>
+                <w:b/>
+                <w:i w:val="0"/>
+                <w:sz w:val="18"/>
+              </w:rPr>
+              <w:t>阅读检查</w:t>
+            </w:r>
+          </w:p>
+        </w:tc>
+        <w:tc>
+          <w:tcPr>
+            <w:tcW w:type="dxa" w:w="4759"/>
+            <w:shd w:fill="DEEAF6" w:val="clear"/>
+          </w:tcPr>
+          <w:p>
+            <w:pPr>
+              <w:jc w:val="center"/>
+            </w:pPr>
+            <w:r>
+              <w:rPr>
+                <w:rFonts w:ascii="微软雅黑" w:hAnsi="微软雅黑" w:eastAsia="微软雅黑"/>
+                <w:b/>
+                <w:i w:val="0"/>
+                <w:sz w:val="18"/>
+              </w:rPr>
+              <w:t>完成标准</w:t>
+            </w:r>
+          </w:p>
+        </w:tc>
+      </w:tr>
+      <w:tr>
+        <w:tc>
+          <w:tcPr>
+            <w:tcW w:type="dxa" w:w="4759"/>
+          </w:tcPr>
+          <w:p>
+            <w:r>
+              <w:rPr>
+                <w:rFonts w:ascii="微软雅黑" w:hAnsi="微软雅黑" w:eastAsia="微软雅黑"/>
+                <w:b w:val="0"/>
+                <w:i w:val="0"/>
+                <w:sz w:val="18"/>
+              </w:rPr>
+              <w:t>输入明确</w:t>
+            </w:r>
+          </w:p>
+        </w:tc>
+        <w:tc>
+          <w:tcPr>
+            <w:tcW w:type="dxa" w:w="4759"/>
+          </w:tcPr>
+          <w:p>
+            <w:r>
+              <w:rPr>
+                <w:rFonts w:ascii="微软雅黑" w:hAnsi="微软雅黑" w:eastAsia="微软雅黑"/>
+                <w:b w:val="0"/>
+                <w:i w:val="0"/>
+                <w:sz w:val="18"/>
+              </w:rPr>
+              <w:t>能说出本步使用的状态、参数、数据集或基线</w:t>
+            </w:r>
+          </w:p>
+        </w:tc>
+      </w:tr>
+      <w:tr>
+        <w:tc>
+          <w:tcPr>
+            <w:tcW w:type="dxa" w:w="4759"/>
+          </w:tcPr>
+          <w:p>
+            <w:r>
+              <w:rPr>
+                <w:rFonts w:ascii="微软雅黑" w:hAnsi="微软雅黑" w:eastAsia="微软雅黑"/>
+                <w:b w:val="0"/>
+                <w:i w:val="0"/>
+                <w:sz w:val="18"/>
+              </w:rPr>
+              <w:t>中间过程可见</w:t>
+            </w:r>
+          </w:p>
+        </w:tc>
+        <w:tc>
+          <w:tcPr>
+            <w:tcW w:type="dxa" w:w="4759"/>
+          </w:tcPr>
+          <w:p>
+            <w:r>
+              <w:rPr>
+                <w:rFonts w:ascii="微软雅黑" w:hAnsi="微软雅黑" w:eastAsia="微软雅黑"/>
+                <w:b w:val="0"/>
+                <w:i w:val="0"/>
+                <w:sz w:val="18"/>
+              </w:rPr>
+              <w:t>至少有一段数值演算、过程记录或关键代码</w:t>
+            </w:r>
+          </w:p>
+        </w:tc>
+      </w:tr>
+      <w:tr>
+        <w:tc>
+          <w:tcPr>
+            <w:tcW w:type="dxa" w:w="4759"/>
+          </w:tcPr>
+          <w:p>
+            <w:r>
+              <w:rPr>
+                <w:rFonts w:ascii="微软雅黑" w:hAnsi="微软雅黑" w:eastAsia="微软雅黑"/>
+                <w:b w:val="0"/>
+                <w:i w:val="0"/>
+                <w:sz w:val="18"/>
+              </w:rPr>
+              <w:t>输出可核对</w:t>
+            </w:r>
+          </w:p>
+        </w:tc>
+        <w:tc>
+          <w:tcPr>
+            <w:tcW w:type="dxa" w:w="4759"/>
+          </w:tcPr>
+          <w:p>
+            <w:r>
+              <w:rPr>
+                <w:rFonts w:ascii="微软雅黑" w:hAnsi="微软雅黑" w:eastAsia="微软雅黑"/>
+                <w:b w:val="0"/>
+                <w:i w:val="0"/>
+                <w:sz w:val="18"/>
+              </w:rPr>
+              <w:t>能定位到 CSV、图、日志、断言或封存目录</w:t>
+            </w:r>
+          </w:p>
+        </w:tc>
+      </w:tr>
+      <w:tr>
+        <w:tc>
+          <w:tcPr>
+            <w:tcW w:type="dxa" w:w="4759"/>
+          </w:tcPr>
+          <w:p>
+            <w:r>
+              <w:rPr>
+                <w:rFonts w:ascii="微软雅黑" w:hAnsi="微软雅黑" w:eastAsia="微软雅黑"/>
+                <w:b w:val="0"/>
+                <w:i w:val="0"/>
+                <w:sz w:val="18"/>
+              </w:rPr>
+              <w:t>结论有边界</w:t>
+            </w:r>
+          </w:p>
+        </w:tc>
+        <w:tc>
+          <w:tcPr>
+            <w:tcW w:type="dxa" w:w="4759"/>
+          </w:tcPr>
+          <w:p>
+            <w:r>
+              <w:rPr>
+                <w:rFonts w:ascii="微软雅黑" w:hAnsi="微软雅黑" w:eastAsia="微软雅黑"/>
+                <w:b w:val="0"/>
+                <w:i w:val="0"/>
+                <w:sz w:val="18"/>
+              </w:rPr>
+              <w:t>没有把仿真、replay、候选或稳定性误写成实体验收</w:t>
+            </w:r>
+          </w:p>
+        </w:tc>
+      </w:tr>
+    </w:tbl>
+    <w:p/>
     <w:p>
       <w:pPr>
         <w:spacing w:before="200" w:after="80"/>
@@ -1294,7 +1765,7 @@
           <w:i w:val="0"/>
           <w:sz w:val="21"/>
         </w:rPr>
-        <w:t>口径 B：v4 首轮 80×7 统一密封</w:t>
+        <w:t>口径 B：E2 当前轮 80×7 冻结策略重评</w:t>
       </w:r>
       <w:r>
         <w:rPr>
@@ -1322,7 +1793,26 @@
           <w:i w:val="0"/>
           <w:sz w:val="21"/>
         </w:rPr>
-        <w:t>，七算法同场景同种子，560 条记录）：</w:t>
+        <w:t xml:space="preserve">，七算法同场景同种子，560 条记录；主统计量为逐场景配对比均值，验收含 </w:t>
+      </w:r>
+      <w:r>
+        <w:rPr>
+          <w:rFonts w:ascii="Consolas" w:hAnsi="Consolas" w:eastAsia="微软雅黑"/>
+          <w:b w:val="0"/>
+          <w:i w:val="0"/>
+          <w:color w:val="A31515"/>
+          <w:sz w:val="19"/>
+        </w:rPr>
+        <w:t>recovery_ok</w:t>
+      </w:r>
+      <w:r>
+        <w:rPr>
+          <w:rFonts w:ascii="微软雅黑" w:hAnsi="微软雅黑" w:eastAsia="微软雅黑"/>
+          <w:b w:val="0"/>
+          <w:i w:val="0"/>
+          <w:sz w:val="21"/>
+        </w:rPr>
+        <w:t>）：</w:t>
       </w:r>
     </w:p>
     <w:tbl>
@@ -1332,14 +1822,15 @@
         <w:tblLook w:firstColumn="1" w:firstRow="1" w:lastColumn="0" w:lastRow="0" w:noHBand="0" w:noVBand="1" w:val="04A0"/>
       </w:tblPr>
       <w:tblGrid>
-        <w:gridCol w:w="3173"/>
-        <w:gridCol w:w="3173"/>
-        <w:gridCol w:w="3173"/>
+        <w:gridCol w:w="2379"/>
+        <w:gridCol w:w="2379"/>
+        <w:gridCol w:w="2379"/>
+        <w:gridCol w:w="2379"/>
       </w:tblGrid>
       <w:tr>
         <w:tc>
           <w:tcPr>
-            <w:tcW w:type="dxa" w:w="3173"/>
+            <w:tcW w:type="dxa" w:w="2379"/>
             <w:shd w:fill="DEEAF6" w:val="clear"/>
           </w:tcPr>
           <w:p>
@@ -1359,7 +1850,7 @@
         </w:tc>
         <w:tc>
           <w:tcPr>
-            <w:tcW w:type="dxa" w:w="3173"/>
+            <w:tcW w:type="dxa" w:w="2379"/>
             <w:shd w:fill="DEEAF6" w:val="clear"/>
           </w:tcPr>
           <w:p>
@@ -1373,13 +1864,13 @@
                 <w:i w:val="0"/>
                 <w:sz w:val="18"/>
               </w:rPr>
-              <w:t>均值</w:t>
+              <w:t>均值 J↓</w:t>
             </w:r>
           </w:p>
         </w:tc>
         <w:tc>
           <w:tcPr>
-            <w:tcW w:type="dxa" w:w="3173"/>
+            <w:tcW w:type="dxa" w:w="2379"/>
             <w:shd w:fill="DEEAF6" w:val="clear"/>
           </w:tcPr>
           <w:p>
@@ -1393,7 +1884,27 @@
                 <w:i w:val="0"/>
                 <w:sz w:val="18"/>
               </w:rPr>
-              <w:t>配对目标比均值 [95% CI]</w:t>
+              <w:t>主配对比 [95% CI]</w:t>
+            </w:r>
+          </w:p>
+        </w:tc>
+        <w:tc>
+          <w:tcPr>
+            <w:tcW w:type="dxa" w:w="2379"/>
+            <w:shd w:fill="DEEAF6" w:val="clear"/>
+          </w:tcPr>
+          <w:p>
+            <w:pPr>
+              <w:jc w:val="center"/>
+            </w:pPr>
+            <w:r>
+              <w:rPr>
+                <w:rFonts w:ascii="微软雅黑" w:hAnsi="微软雅黑" w:eastAsia="微软雅黑"/>
+                <w:b/>
+                <w:i w:val="0"/>
+                <w:sz w:val="18"/>
+              </w:rPr>
+              <w:t>验收</w:t>
             </w:r>
           </w:p>
         </w:tc>
@@ -1401,7 +1912,7 @@
       <w:tr>
         <w:tc>
           <w:tcPr>
-            <w:tcW w:type="dxa" w:w="3173"/>
+            <w:tcW w:type="dxa" w:w="2379"/>
           </w:tcPr>
           <w:p>
             <w:r>
@@ -1417,7 +1928,7 @@
         </w:tc>
         <w:tc>
           <w:tcPr>
-            <w:tcW w:type="dxa" w:w="3173"/>
+            <w:tcW w:type="dxa" w:w="2379"/>
           </w:tcPr>
           <w:p>
             <w:r>
@@ -1433,7 +1944,7 @@
         </w:tc>
         <w:tc>
           <w:tcPr>
-            <w:tcW w:type="dxa" w:w="3173"/>
+            <w:tcW w:type="dxa" w:w="2379"/>
           </w:tcPr>
           <w:p>
             <w:r>
@@ -1443,7 +1954,23 @@
                 <w:i w:val="0"/>
                 <w:sz w:val="18"/>
               </w:rPr>
-              <w:t>1.4995 [1.4105, 1.5954]</w:t>
+              <w:t>1.6520 [1.5427, 1.7666]</w:t>
+            </w:r>
+          </w:p>
+        </w:tc>
+        <w:tc>
+          <w:tcPr>
+            <w:tcW w:type="dxa" w:w="2379"/>
+          </w:tcPr>
+          <w:p>
+            <w:r>
+              <w:rPr>
+                <w:rFonts w:ascii="微软雅黑" w:hAnsi="微软雅黑" w:eastAsia="微软雅黑"/>
+                <w:b w:val="0"/>
+                <w:i w:val="0"/>
+                <w:sz w:val="18"/>
+              </w:rPr>
+              <w:t>6/80</w:t>
             </w:r>
           </w:p>
         </w:tc>
@@ -1451,7 +1978,7 @@
       <w:tr>
         <w:tc>
           <w:tcPr>
-            <w:tcW w:type="dxa" w:w="3173"/>
+            <w:tcW w:type="dxa" w:w="2379"/>
           </w:tcPr>
           <w:p>
             <w:r>
@@ -1467,7 +1994,7 @@
         </w:tc>
         <w:tc>
           <w:tcPr>
-            <w:tcW w:type="dxa" w:w="3173"/>
+            <w:tcW w:type="dxa" w:w="2379"/>
           </w:tcPr>
           <w:p>
             <w:r>
@@ -1483,7 +2010,7 @@
         </w:tc>
         <w:tc>
           <w:tcPr>
-            <w:tcW w:type="dxa" w:w="3173"/>
+            <w:tcW w:type="dxa" w:w="2379"/>
           </w:tcPr>
           <w:p>
             <w:r>
@@ -1497,11 +2024,27 @@
             </w:r>
           </w:p>
         </w:tc>
+        <w:tc>
+          <w:tcPr>
+            <w:tcW w:type="dxa" w:w="2379"/>
+          </w:tcPr>
+          <w:p>
+            <w:r>
+              <w:rPr>
+                <w:rFonts w:ascii="微软雅黑" w:hAnsi="微软雅黑" w:eastAsia="微软雅黑"/>
+                <w:b w:val="0"/>
+                <w:i w:val="0"/>
+                <w:sz w:val="18"/>
+              </w:rPr>
+              <w:t>39/80</w:t>
+            </w:r>
+          </w:p>
+        </w:tc>
       </w:tr>
       <w:tr>
         <w:tc>
           <w:tcPr>
-            <w:tcW w:type="dxa" w:w="3173"/>
+            <w:tcW w:type="dxa" w:w="2379"/>
           </w:tcPr>
           <w:p>
             <w:r>
@@ -1517,7 +2060,7 @@
         </w:tc>
         <w:tc>
           <w:tcPr>
-            <w:tcW w:type="dxa" w:w="3173"/>
+            <w:tcW w:type="dxa" w:w="2379"/>
           </w:tcPr>
           <w:p>
             <w:r>
@@ -1533,7 +2076,7 @@
         </w:tc>
         <w:tc>
           <w:tcPr>
-            <w:tcW w:type="dxa" w:w="3173"/>
+            <w:tcW w:type="dxa" w:w="2379"/>
           </w:tcPr>
           <w:p>
             <w:r>
@@ -1543,15 +2086,13 @@
                 <w:i w:val="0"/>
                 <w:sz w:val="18"/>
               </w:rPr>
-              <w:t>1.0168 [0.9975, 1.0375]</w:t>
+              <w:t>0.9996 [0.9808, 1.0193]</w:t>
             </w:r>
           </w:p>
         </w:tc>
-      </w:tr>
-      <w:tr>
         <w:tc>
           <w:tcPr>
-            <w:tcW w:type="dxa" w:w="3173"/>
+            <w:tcW w:type="dxa" w:w="2379"/>
           </w:tcPr>
           <w:p>
             <w:r>
@@ -1561,13 +2102,31 @@
                 <w:i w:val="0"/>
                 <w:sz w:val="18"/>
               </w:rPr>
-              <w:t>Safe BO</w:t>
+              <w:t>38/80</w:t>
+            </w:r>
+          </w:p>
+        </w:tc>
+      </w:tr>
+      <w:tr>
+        <w:tc>
+          <w:tcPr>
+            <w:tcW w:type="dxa" w:w="2379"/>
+          </w:tcPr>
+          <w:p>
+            <w:r>
+              <w:rPr>
+                <w:rFonts w:ascii="微软雅黑" w:hAnsi="微软雅黑" w:eastAsia="微软雅黑"/>
+                <w:b w:val="0"/>
+                <w:i w:val="0"/>
+                <w:sz w:val="18"/>
+              </w:rPr>
+              <w:t>Safe BO（保守参数）</w:t>
             </w:r>
           </w:p>
         </w:tc>
         <w:tc>
           <w:tcPr>
-            <w:tcW w:type="dxa" w:w="3173"/>
+            <w:tcW w:type="dxa" w:w="2379"/>
           </w:tcPr>
           <w:p>
             <w:r>
@@ -1583,7 +2142,7 @@
         </w:tc>
         <w:tc>
           <w:tcPr>
-            <w:tcW w:type="dxa" w:w="3173"/>
+            <w:tcW w:type="dxa" w:w="2379"/>
           </w:tcPr>
           <w:p>
             <w:r>
@@ -1593,7 +2152,23 @@
                 <w:i w:val="0"/>
                 <w:sz w:val="18"/>
               </w:rPr>
-              <w:t>0.8911 [0.8597, 0.9214]</w:t>
+              <w:t>0.9185 [0.8863, 0.9516]</w:t>
+            </w:r>
+          </w:p>
+        </w:tc>
+        <w:tc>
+          <w:tcPr>
+            <w:tcW w:type="dxa" w:w="2379"/>
+          </w:tcPr>
+          <w:p>
+            <w:r>
+              <w:rPr>
+                <w:rFonts w:ascii="微软雅黑" w:hAnsi="微软雅黑" w:eastAsia="微软雅黑"/>
+                <w:b w:val="0"/>
+                <w:i w:val="0"/>
+                <w:sz w:val="18"/>
+              </w:rPr>
+              <w:t>51/80</w:t>
             </w:r>
           </w:p>
         </w:tc>
@@ -1601,7 +2176,7 @@
       <w:tr>
         <w:tc>
           <w:tcPr>
-            <w:tcW w:type="dxa" w:w="3173"/>
+            <w:tcW w:type="dxa" w:w="2379"/>
           </w:tcPr>
           <w:p>
             <w:r>
@@ -1617,7 +2192,7 @@
         </w:tc>
         <w:tc>
           <w:tcPr>
-            <w:tcW w:type="dxa" w:w="3173"/>
+            <w:tcW w:type="dxa" w:w="2379"/>
           </w:tcPr>
           <w:p>
             <w:r>
@@ -1633,7 +2208,7 @@
         </w:tc>
         <w:tc>
           <w:tcPr>
-            <w:tcW w:type="dxa" w:w="3173"/>
+            <w:tcW w:type="dxa" w:w="2379"/>
           </w:tcPr>
           <w:p>
             <w:r>
@@ -1643,7 +2218,23 @@
                 <w:i w:val="0"/>
                 <w:sz w:val="18"/>
               </w:rPr>
-              <w:t>1.0046 [0.9964, 1.0133]</w:t>
+              <w:t>0.9980 [0.9886, 1.0084]</w:t>
+            </w:r>
+          </w:p>
+        </w:tc>
+        <w:tc>
+          <w:tcPr>
+            <w:tcW w:type="dxa" w:w="2379"/>
+          </w:tcPr>
+          <w:p>
+            <w:r>
+              <w:rPr>
+                <w:rFonts w:ascii="微软雅黑" w:hAnsi="微软雅黑" w:eastAsia="微软雅黑"/>
+                <w:b w:val="0"/>
+                <w:i w:val="0"/>
+                <w:sz w:val="18"/>
+              </w:rPr>
+              <w:t>40/80</w:t>
             </w:r>
           </w:p>
         </w:tc>
@@ -1651,7 +2242,7 @@
       <w:tr>
         <w:tc>
           <w:tcPr>
-            <w:tcW w:type="dxa" w:w="3173"/>
+            <w:tcW w:type="dxa" w:w="2379"/>
           </w:tcPr>
           <w:p>
             <w:r>
@@ -1667,7 +2258,7 @@
         </w:tc>
         <w:tc>
           <w:tcPr>
-            <w:tcW w:type="dxa" w:w="3173"/>
+            <w:tcW w:type="dxa" w:w="2379"/>
           </w:tcPr>
           <w:p>
             <w:r>
@@ -1683,7 +2274,7 @@
         </w:tc>
         <w:tc>
           <w:tcPr>
-            <w:tcW w:type="dxa" w:w="3173"/>
+            <w:tcW w:type="dxa" w:w="2379"/>
           </w:tcPr>
           <w:p>
             <w:r>
@@ -1693,7 +2284,23 @@
                 <w:i w:val="0"/>
                 <w:sz w:val="18"/>
               </w:rPr>
-              <w:t>0.9664 [0.9434, 0.9917]</w:t>
+              <w:t>0.9817 [0.9620, 1.0070]</w:t>
+            </w:r>
+          </w:p>
+        </w:tc>
+        <w:tc>
+          <w:tcPr>
+            <w:tcW w:type="dxa" w:w="2379"/>
+          </w:tcPr>
+          <w:p>
+            <w:r>
+              <w:rPr>
+                <w:rFonts w:ascii="微软雅黑" w:hAnsi="微软雅黑" w:eastAsia="微软雅黑"/>
+                <w:b w:val="0"/>
+                <w:i w:val="0"/>
+                <w:sz w:val="18"/>
+              </w:rPr>
+              <w:t>39/80</w:t>
             </w:r>
           </w:p>
         </w:tc>
@@ -1701,7 +2308,7 @@
       <w:tr>
         <w:tc>
           <w:tcPr>
-            <w:tcW w:type="dxa" w:w="3173"/>
+            <w:tcW w:type="dxa" w:w="2379"/>
           </w:tcPr>
           <w:p>
             <w:r>
@@ -1717,7 +2324,7 @@
         </w:tc>
         <w:tc>
           <w:tcPr>
-            <w:tcW w:type="dxa" w:w="3173"/>
+            <w:tcW w:type="dxa" w:w="2379"/>
           </w:tcPr>
           <w:p>
             <w:r>
@@ -1733,7 +2340,7 @@
         </w:tc>
         <w:tc>
           <w:tcPr>
-            <w:tcW w:type="dxa" w:w="3173"/>
+            <w:tcW w:type="dxa" w:w="2379"/>
           </w:tcPr>
           <w:p>
             <w:r>
@@ -1744,6 +2351,22 @@
                 <w:sz w:val="18"/>
               </w:rPr>
               <w:t>与 IMC 持平（训练集无接受候选，回退 IMC）</w:t>
+            </w:r>
+          </w:p>
+        </w:tc>
+        <w:tc>
+          <w:tcPr>
+            <w:tcW w:type="dxa" w:w="2379"/>
+          </w:tcPr>
+          <w:p>
+            <w:r>
+              <w:rPr>
+                <w:rFonts w:ascii="微软雅黑" w:hAnsi="微软雅黑" w:eastAsia="微软雅黑"/>
+                <w:b w:val="0"/>
+                <w:i w:val="0"/>
+                <w:sz w:val="18"/>
+              </w:rPr>
+              <w:t>39/80</w:t>
             </w:r>
           </w:p>
         </w:tc>

</xml_diff>